<commit_message>
Qualify Top-10 transfer cost and state random-half evidence directly
- X-D and XII: the 0.013 macro F1 cost is the largest mean across selection
  seeds (worst single seed 0.017), not a bound on every run.
- X-A: replace "not random noise" with the observation that the random-half
  gaps are positive in all reported repeats.
</commit_message>
<xml_diff>
--- a/paper/SHAP_VPN_revised_v7.docx
+++ b/paper/SHAP_VPN_revised_v7.docx
@@ -23891,7 +23891,7 @@
         <w:jc w:val="both"/>
       </w:pPr>
       <w:r>
-        <w:t xml:space="preserve">The answer to the question in the title depends on what cross-context agreement is compared with. Against models trained on random halves of one context, VPN and Non-VPN rankings disagree clearly more, and the permutation null shows that neither the half-split procedure nor the class-mix difference produces such a gap. When the training halves are built from whole clusters of related flows, the Spearman excess shrinks substantially, and its mean approaches zero only under the coarsest grouping; the top-weighted RBO gaps shrink less, and the Random Forest Spearman gap is still positive in every repeat with clusters of about 35 flows. The cross-context difference is not random noise, but much of it is of the same order as the difference between clusters of related flows within one context. Because the clusters are only a proxy for capture sessions and the outer 80/20 split stays random, these experiments establish sensitivity to grouping, not the size of a true between-session effect. Without session identifiers or an independent second capture, the benchmark cannot show whether the VPN itself changes model reliance. A random within-context split, which is the usual way such references are built, would have suggested that it does.</w:t>
+        <w:t xml:space="preserve">The answer to the question in the title depends on what cross-context agreement is compared with. Against models trained on random halves of one context, VPN and Non-VPN rankings disagree clearly more, and the permutation null shows that neither the half-split procedure nor the class-mix difference produces such a gap. When the training halves are built from whole clusters of related flows, the Spearman excess shrinks substantially, and its mean approaches zero only under the coarsest grouping; the top-weighted RBO gaps shrink less, and the Random Forest Spearman gap is still positive in every repeat with clusters of about 35 flows. The random-half gaps are positive across all reported repeats, but much of the cross-context difference is of the same order as the difference between clusters of related flows within one context. Because the clusters are only a proxy for capture sessions and the outer 80/20 split stays random, these experiments establish sensitivity to grouping, not the size of a true between-session effect. Without session identifiers or an independent second capture, the benchmark cannot show whether the VPN itself changes model reliance. A random within-context split, which is the usual way such references are built, would have suggested that it does.</w:t>
       </w:r>
     </w:p>
     <w:p>
@@ -23951,7 +23951,7 @@
         <w:jc w:val="both"/>
       </w:pPr>
       <w:r>
-        <w:t xml:space="preserve">The two consequence tests point in different directions. A trained model does not survive the change of context: macro F1 falls to 0.43–0.61. A SHAP-selected feature list mostly does: at k = 10 and 15 the transferred list loses at most about 0.013 macro F1, and for some targets it does better than the own list. Feature lists are coarse summaries that tolerate the ranking disagreement, while the models built on them are not. At k = 5, where the lists differ in two of five features, the cost can reach 0.05 for one model and context, so the conclusion holds only for moderately long lists.</w:t>
+        <w:t xml:space="preserve">The two consequence tests point in different directions. A trained model does not survive the change of context: macro F1 falls to 0.43–0.61. A SHAP-selected feature list mostly does: at k = 10 and 15 the transferred list loses at most about 0.013 macro F1 on average across selection seeds (0.017 for the worst single seed), and for some targets it does better than the own list. Feature lists are coarse summaries that tolerate the ranking disagreement, while the models built on them are not. At k = 5, where the lists differ in two of five features, the cost can reach 0.05 for one model and context, so the conclusion holds only for moderately long lists.</w:t>
       </w:r>
     </w:p>
     <w:p>
@@ -24159,7 +24159,7 @@
         <w:jc w:val="both"/>
       </w:pPr>
       <w:r>
-        <w:t xml:space="preserve">Whether this disagreement reflects the context depends on the reference. Against random halves of one context the within-minus-cross gap is 0.13 for XGBoost and 0.19 for Random Forest over 11 repeats with redrawn partitions, and a permutation null that keeps the class mixes gives little or none (−0.002 and +0.028). When the training halves keep clusters of similar flows together, the Spearman gap shrinks to 0.08–0.10 with clusters of about ten flows and 0.01–0.04 with about 35, and its mean approaches zero only with the coarsest clusters; top-weighted RBO gaps shrink less. Class mix explains little, and the most visible shift, the rise of the minimum IATs, is partly a redistribution of Shapley credit among correlated timing features. A SHAP-selected feature list transfers between contexts at a cost of at most about 0.013 macro F1 for lists of ten or more features.</w:t>
+        <w:t xml:space="preserve">Whether this disagreement reflects the context depends on the reference. Against random halves of one context the within-minus-cross gap is 0.13 for XGBoost and 0.19 for Random Forest over 11 repeats with redrawn partitions, and a permutation null that keeps the class mixes gives little or none (−0.002 and +0.028). When the training halves keep clusters of similar flows together, the Spearman gap shrinks to 0.08–0.10 with clusters of about ten flows and 0.01–0.04 with about 35, and its mean approaches zero only with the coarsest clusters; top-weighted RBO gaps shrink less. Class mix explains little, and the most visible shift, the rise of the minimum IATs, is partly a redistribution of Shapley credit among correlated timing features. A SHAP-selected feature list transfers between contexts at a cost of at most about 0.013 macro F1 on average across selection seeds for lists of ten or more features.</w:t>
       </w:r>
     </w:p>
     <w:p>

</xml_diff>